<commit_message>
Improved R&D in documentation
</commit_message>
<xml_diff>
--- a/Hobby/Gintama Kai/Documents/Gintama Kai (tentative title)/Gintama Kai (tentative title) Planning & Development.docx
+++ b/Hobby/Gintama Kai/Documents/Gintama Kai (tentative title)/Gintama Kai (tentative title) Planning & Development.docx
@@ -1,13 +1,12 @@
 
 <file path=word/document.xml><?xml version="1.0" encoding="utf-8"?>
-<w:document xmlns:o="urn:schemas-microsoft-com:office:office" xmlns:r="http://schemas.openxmlformats.org/officeDocument/2006/relationships" xmlns:v="urn:schemas-microsoft-com:vml" xmlns:w="http://schemas.openxmlformats.org/wordprocessingml/2006/main" xmlns:w10="urn:schemas-microsoft-com:office:word" xmlns:wp="http://schemas.openxmlformats.org/drawingml/2006/wordprocessingDrawing" xmlns:wps="http://schemas.microsoft.com/office/word/2010/wordprocessingShape" xmlns:wpg="http://schemas.microsoft.com/office/word/2010/wordprocessingGroup" xmlns:mc="http://schemas.openxmlformats.org/markup-compatibility/2006" xmlns:wp14="http://schemas.microsoft.com/office/word/2010/wordprocessingDrawing" xmlns:w14="http://schemas.microsoft.com/office/word/2010/wordml" mc:Ignorable="w14 wp14">
+<w:document xmlns:o="urn:schemas-microsoft-com:office:office" xmlns:r="http://schemas.openxmlformats.org/officeDocument/2006/relationships" xmlns:v="urn:schemas-microsoft-com:vml" xmlns:w="http://schemas.openxmlformats.org/wordprocessingml/2006/main" xmlns:w10="urn:schemas-microsoft-com:office:word" xmlns:wp="http://schemas.openxmlformats.org/drawingml/2006/wordprocessingDrawing" xmlns:wps="http://schemas.microsoft.com/office/word/2010/wordprocessingShape" xmlns:wpg="http://schemas.microsoft.com/office/word/2010/wordprocessingGroup" xmlns:mc="http://schemas.openxmlformats.org/markup-compatibility/2006" xmlns:wp14="http://schemas.microsoft.com/office/word/2010/wordprocessingDrawing" xmlns:w14="http://schemas.microsoft.com/office/word/2010/wordml" xmlns:w15="http://schemas.microsoft.com/office/word/2012/wordml" mc:Ignorable="w14 wp14 w15">
   <w:body>
     <w:p>
       <w:pPr>
         <w:pStyle w:val="Normal"/>
         <w:jc w:val="center"/>
         <w:rPr>
-          <w:b/>
           <w:b/>
           <w:sz w:val="36"/>
           <w:lang w:val="en-US"/>
@@ -28,57 +27,54 @@
         <w:jc w:val="center"/>
         <w:rPr>
           <w:b/>
+          <w:sz w:val="36"/>
+          <w:lang w:val="en-US"/>
+        </w:rPr>
+      </w:pPr>
+      <w:r>
+        <w:rPr>
           <w:b/>
           <w:sz w:val="36"/>
           <w:lang w:val="en-US"/>
         </w:rPr>
-      </w:pPr>
-      <w:r>
+        <w:t>The</w:t>
+      </w:r>
+    </w:p>
+    <w:p>
+      <w:pPr>
+        <w:pStyle w:val="Normal"/>
+        <w:jc w:val="center"/>
         <w:rPr>
           <w:b/>
           <w:sz w:val="36"/>
           <w:lang w:val="en-US"/>
         </w:rPr>
-        <w:t>The</w:t>
-      </w:r>
-    </w:p>
-    <w:p>
-      <w:pPr>
-        <w:pStyle w:val="Normal"/>
-        <w:jc w:val="center"/>
-        <w:rPr>
-          <w:b/>
+      </w:pPr>
+      <w:r>
+        <w:rPr>
           <w:b/>
           <w:sz w:val="36"/>
           <w:lang w:val="en-US"/>
         </w:rPr>
-      </w:pPr>
-      <w:r>
+        <w:t>Visual Novel</w:t>
+      </w:r>
+    </w:p>
+    <w:p>
+      <w:pPr>
+        <w:pStyle w:val="Normal"/>
+        <w:jc w:val="center"/>
         <w:rPr>
           <w:b/>
           <w:sz w:val="36"/>
           <w:lang w:val="en-US"/>
         </w:rPr>
-        <w:t>Visual Novel</w:t>
-      </w:r>
-    </w:p>
-    <w:p>
-      <w:pPr>
-        <w:pStyle w:val="Normal"/>
-        <w:jc w:val="center"/>
-        <w:rPr>
-          <w:b/>
+      </w:pPr>
+      <w:r>
+        <w:rPr>
           <w:b/>
           <w:sz w:val="36"/>
           <w:lang w:val="en-US"/>
         </w:rPr>
-      </w:pPr>
-      <w:r>
-        <w:rPr>
-          <w:b/>
-          <w:sz w:val="36"/>
-          <w:lang w:val="en-US"/>
-        </w:rPr>
       </w:r>
     </w:p>
     <w:p>
@@ -86,7 +82,6 @@
         <w:pStyle w:val="Normal"/>
         <w:jc w:val="center"/>
         <w:rPr>
-          <w:b/>
           <w:b/>
           <w:sz w:val="36"/>
           <w:lang w:val="en-US"/>
@@ -243,86 +238,83 @@
         <w:pStyle w:val="Normal"/>
         <w:rPr>
           <w:b/>
+          <w:sz w:val="32"/>
+          <w:lang w:val="en-US"/>
+        </w:rPr>
+      </w:pPr>
+      <w:r>
+        <w:rPr>
           <w:b/>
           <w:sz w:val="32"/>
           <w:lang w:val="en-US"/>
         </w:rPr>
-      </w:pPr>
-      <w:r>
+        <w:t xml:space="preserve">Schedule </w:t>
+      </w:r>
+    </w:p>
+    <w:p>
+      <w:pPr>
+        <w:pStyle w:val="Normal"/>
         <w:rPr>
           <w:b/>
           <w:sz w:val="32"/>
           <w:lang w:val="en-US"/>
         </w:rPr>
-        <w:t xml:space="preserve">Schedule </w:t>
-      </w:r>
-    </w:p>
-    <w:p>
-      <w:pPr>
-        <w:pStyle w:val="Normal"/>
-        <w:rPr>
-          <w:b/>
+      </w:pPr>
+      <w:r>
+        <w:rPr>
           <w:b/>
           <w:sz w:val="32"/>
           <w:lang w:val="en-US"/>
         </w:rPr>
-      </w:pPr>
-      <w:r>
+      </w:r>
+    </w:p>
+    <w:p>
+      <w:pPr>
+        <w:pStyle w:val="Normal"/>
+        <w:rPr>
+          <w:sz w:val="28"/>
+          <w:lang w:val="en-US"/>
+        </w:rPr>
+      </w:pPr>
+      <w:r>
+        <w:rPr>
+          <w:sz w:val="28"/>
+          <w:lang w:val="en-US"/>
+        </w:rPr>
+        <w:t xml:space="preserve">Titlescreen: </w:t>
+      </w:r>
+    </w:p>
+    <w:p>
+      <w:pPr>
+        <w:pStyle w:val="Normal"/>
+        <w:rPr>
+          <w:sz w:val="28"/>
+          <w:lang w:val="en-US"/>
+        </w:rPr>
+      </w:pPr>
+      <w:r>
+        <w:rPr>
+          <w:sz w:val="28"/>
+          <w:lang w:val="en-US"/>
+        </w:rPr>
+        <w:t xml:space="preserve">Show titlescreen where there are transitions within the background and where the logo displays at the center of it. The three main characters (Gintoki, Shinpachi, Kagura) are display in the foreground. Play a shuffle of Gintama openings after 45 seconds of no direct input of the player.   </w:t>
+      </w:r>
+    </w:p>
+    <w:p>
+      <w:pPr>
+        <w:pStyle w:val="Normal"/>
         <w:rPr>
           <w:b/>
           <w:sz w:val="32"/>
           <w:lang w:val="en-US"/>
         </w:rPr>
-      </w:r>
-    </w:p>
-    <w:p>
-      <w:pPr>
-        <w:pStyle w:val="Normal"/>
-        <w:rPr>
-          <w:sz w:val="28"/>
-          <w:lang w:val="en-US"/>
-        </w:rPr>
-      </w:pPr>
-      <w:r>
-        <w:rPr>
-          <w:sz w:val="28"/>
-          <w:lang w:val="en-US"/>
-        </w:rPr>
-        <w:t xml:space="preserve">Titlescreen: </w:t>
-      </w:r>
-    </w:p>
-    <w:p>
-      <w:pPr>
-        <w:pStyle w:val="Normal"/>
-        <w:rPr>
-          <w:sz w:val="28"/>
-          <w:lang w:val="en-US"/>
-        </w:rPr>
-      </w:pPr>
-      <w:r>
-        <w:rPr>
-          <w:sz w:val="28"/>
-          <w:lang w:val="en-US"/>
-        </w:rPr>
-        <w:t xml:space="preserve">Show titlescreen where there are transitions within the background and where the logo displays at the center of it. The three main characters (Gintoki, Shinpachi, Kagura) are display in the foreground. Play a shuffle of Gintama openings after 45 seconds of no direct input of the player.   </w:t>
-      </w:r>
-    </w:p>
-    <w:p>
-      <w:pPr>
-        <w:pStyle w:val="Normal"/>
-        <w:rPr>
-          <w:b/>
+      </w:pPr>
+      <w:r>
+        <w:rPr>
           <w:b/>
           <w:sz w:val="32"/>
           <w:lang w:val="en-US"/>
         </w:rPr>
-      </w:pPr>
-      <w:r>
-        <w:rPr>
-          <w:b/>
-          <w:sz w:val="32"/>
-          <w:lang w:val="en-US"/>
-        </w:rPr>
       </w:r>
     </w:p>
     <w:p>
@@ -363,7 +355,6 @@
       <w:pPr>
         <w:pStyle w:val="Normal"/>
         <w:rPr>
-          <w:b/>
           <w:b/>
           <w:sz w:val="32"/>
           <w:lang w:val="en-US"/>
@@ -708,26 +699,26 @@
     <w:p>
       <w:pPr>
         <w:pStyle w:val="ListParagraph"/>
-        <w:ind w:left="3564" w:hanging="0"/>
-        <w:rPr>
-          <w:i/>
-          <w:i/>
-          <w:sz w:val="28"/>
-          <w:lang w:val="en-US"/>
-        </w:rPr>
-      </w:pPr>
-      <w:r>
-        <w:rPr>
-          <w:i/>
-          <w:sz w:val="28"/>
-          <w:lang w:val="en-US"/>
-        </w:rPr>
-      </w:r>
-    </w:p>
-    <w:p>
-      <w:pPr>
-        <w:pStyle w:val="ListParagraph"/>
-        <w:ind w:left="3564" w:hanging="0"/>
+        <w:ind w:hanging="0" w:left="3564"/>
+        <w:rPr>
+          <w:i/>
+          <w:i/>
+          <w:sz w:val="28"/>
+          <w:lang w:val="en-US"/>
+        </w:rPr>
+      </w:pPr>
+      <w:r>
+        <w:rPr>
+          <w:i/>
+          <w:sz w:val="28"/>
+          <w:lang w:val="en-US"/>
+        </w:rPr>
+      </w:r>
+    </w:p>
+    <w:p>
+      <w:pPr>
+        <w:pStyle w:val="ListParagraph"/>
+        <w:ind w:hanging="0" w:left="3564"/>
         <w:rPr>
           <w:i/>
           <w:i/>
@@ -772,7 +763,7 @@
     <w:p>
       <w:pPr>
         <w:pStyle w:val="ListParagraph"/>
-        <w:ind w:left="3564" w:hanging="0"/>
+        <w:ind w:hanging="0" w:left="3564"/>
         <w:rPr>
           <w:i/>
           <w:i/>
@@ -817,7 +808,7 @@
     <w:p>
       <w:pPr>
         <w:pStyle w:val="ListParagraph"/>
-        <w:ind w:left="3564" w:hanging="0"/>
+        <w:ind w:hanging="0" w:left="3564"/>
         <w:rPr>
           <w:i/>
           <w:i/>
@@ -862,7 +853,7 @@
     <w:p>
       <w:pPr>
         <w:pStyle w:val="ListParagraph"/>
-        <w:ind w:left="3564" w:hanging="0"/>
+        <w:ind w:hanging="0" w:left="3564"/>
         <w:rPr>
           <w:i/>
           <w:i/>
@@ -907,7 +898,7 @@
     <w:p>
       <w:pPr>
         <w:pStyle w:val="ListParagraph"/>
-        <w:ind w:left="3564" w:hanging="0"/>
+        <w:ind w:hanging="0" w:left="3564"/>
         <w:rPr>
           <w:i/>
           <w:i/>
@@ -952,7 +943,7 @@
     <w:p>
       <w:pPr>
         <w:pStyle w:val="ListParagraph"/>
-        <w:ind w:left="3564" w:hanging="0"/>
+        <w:ind w:hanging="0" w:left="3564"/>
         <w:rPr>
           <w:i/>
           <w:i/>
@@ -997,7 +988,7 @@
     <w:p>
       <w:pPr>
         <w:pStyle w:val="ListParagraph"/>
-        <w:ind w:left="3564" w:hanging="0"/>
+        <w:ind w:hanging="0" w:left="3564"/>
         <w:rPr>
           <w:i/>
           <w:i/>
@@ -1042,7 +1033,7 @@
     <w:p>
       <w:pPr>
         <w:pStyle w:val="ListParagraph"/>
-        <w:ind w:left="3564" w:hanging="0"/>
+        <w:ind w:hanging="0" w:left="3564"/>
         <w:rPr>
           <w:i/>
           <w:i/>
@@ -1087,7 +1078,7 @@
     <w:p>
       <w:pPr>
         <w:pStyle w:val="ListParagraph"/>
-        <w:ind w:left="3564" w:hanging="0"/>
+        <w:ind w:hanging="0" w:left="3564"/>
         <w:rPr>
           <w:i/>
           <w:i/>
@@ -1132,7 +1123,7 @@
     <w:p>
       <w:pPr>
         <w:pStyle w:val="ListParagraph"/>
-        <w:ind w:left="3564" w:hanging="0"/>
+        <w:ind w:hanging="0" w:left="3564"/>
         <w:rPr>
           <w:i/>
           <w:i/>
@@ -1177,7 +1168,7 @@
     <w:p>
       <w:pPr>
         <w:pStyle w:val="ListParagraph"/>
-        <w:ind w:left="3564" w:hanging="0"/>
+        <w:ind w:hanging="0" w:left="3564"/>
         <w:rPr>
           <w:i/>
           <w:i/>
@@ -1222,7 +1213,7 @@
     <w:p>
       <w:pPr>
         <w:pStyle w:val="ListParagraph"/>
-        <w:ind w:left="3564" w:hanging="0"/>
+        <w:ind w:hanging="0" w:left="3564"/>
         <w:rPr>
           <w:i/>
           <w:i/>
@@ -1382,7 +1373,7 @@
     <w:p>
       <w:pPr>
         <w:pStyle w:val="Normal"/>
-        <w:ind w:left="2484" w:hanging="0"/>
+        <w:ind w:hanging="0" w:left="2484"/>
         <w:rPr>
           <w:i/>
           <w:i/>
@@ -1628,7 +1619,7 @@
     <w:p>
       <w:pPr>
         <w:pStyle w:val="ListParagraph"/>
-        <w:ind w:left="1425" w:hanging="0"/>
+        <w:ind w:hanging="0" w:left="1425"/>
         <w:rPr>
           <w:i/>
           <w:i/>
@@ -1727,24 +1718,22 @@
         <w:pStyle w:val="Normal"/>
         <w:rPr>
           <w:b/>
+          <w:sz w:val="28"/>
+          <w:lang w:val="en-US"/>
+        </w:rPr>
+      </w:pPr>
+      <w:r>
+        <w:rPr>
           <w:b/>
           <w:sz w:val="28"/>
           <w:lang w:val="en-US"/>
         </w:rPr>
-      </w:pPr>
-      <w:r>
-        <w:rPr>
-          <w:b/>
-          <w:sz w:val="28"/>
-          <w:lang w:val="en-US"/>
-        </w:rPr>
-      </w:r>
-    </w:p>
-    <w:p>
-      <w:pPr>
-        <w:pStyle w:val="Normal"/>
-        <w:rPr>
-          <w:b/>
+      </w:r>
+    </w:p>
+    <w:p>
+      <w:pPr>
+        <w:pStyle w:val="Normal"/>
+        <w:rPr>
           <w:b/>
           <w:sz w:val="28"/>
           <w:lang w:val="en-US"/>
@@ -2072,7 +2061,6 @@
       <w:pPr>
         <w:pStyle w:val="Normal"/>
         <w:rPr>
-          <w:b/>
           <w:b/>
           <w:sz w:val="32"/>
           <w:lang w:val="en-US"/>
@@ -2220,17 +2208,16 @@
         <w:pStyle w:val="Normal"/>
         <w:rPr>
           <w:b/>
+          <w:sz w:val="28"/>
+          <w:lang w:val="en-US"/>
+        </w:rPr>
+      </w:pPr>
+      <w:r>
+        <w:rPr>
           <w:b/>
           <w:sz w:val="28"/>
           <w:lang w:val="en-US"/>
         </w:rPr>
-      </w:pPr>
-      <w:r>
-        <w:rPr>
-          <w:b/>
-          <w:sz w:val="28"/>
-          <w:lang w:val="en-US"/>
-        </w:rPr>
         <w:t>Learning &amp; practice Ren’Py</w:t>
       </w:r>
     </w:p>
@@ -2238,7 +2225,6 @@
       <w:pPr>
         <w:pStyle w:val="Normal"/>
         <w:rPr>
-          <w:b/>
           <w:b/>
           <w:sz w:val="24"/>
           <w:lang w:val="en-US"/>
@@ -2536,24 +2522,39 @@
         <w:pStyle w:val="Normal"/>
         <w:rPr>
           <w:b/>
+          <w:sz w:val="24"/>
+          <w:lang w:val="en-US"/>
+        </w:rPr>
+      </w:pPr>
+      <w:r>
+        <w:rPr>
           <w:b/>
           <w:sz w:val="24"/>
           <w:lang w:val="en-US"/>
         </w:rPr>
-      </w:pPr>
-      <w:r>
+      </w:r>
+    </w:p>
+    <w:p>
+      <w:pPr>
+        <w:pStyle w:val="Normal"/>
         <w:rPr>
           <w:b/>
           <w:sz w:val="24"/>
           <w:lang w:val="en-US"/>
         </w:rPr>
-      </w:r>
-    </w:p>
-    <w:p>
-      <w:pPr>
-        <w:pStyle w:val="Normal"/>
+      </w:pPr>
+      <w:r>
         <w:rPr>
           <w:b/>
+          <w:sz w:val="24"/>
+          <w:lang w:val="en-US"/>
+        </w:rPr>
+      </w:r>
+    </w:p>
+    <w:p>
+      <w:pPr>
+        <w:pStyle w:val="Normal"/>
+        <w:rPr>
           <w:b/>
           <w:sz w:val="24"/>
           <w:lang w:val="en-US"/>
@@ -2572,24 +2573,39 @@
         <w:pStyle w:val="Normal"/>
         <w:rPr>
           <w:b/>
+          <w:sz w:val="24"/>
+          <w:lang w:val="en-US"/>
+        </w:rPr>
+      </w:pPr>
+      <w:r>
+        <w:rPr>
           <w:b/>
           <w:sz w:val="24"/>
           <w:lang w:val="en-US"/>
         </w:rPr>
-      </w:pPr>
-      <w:r>
+      </w:r>
+    </w:p>
+    <w:p>
+      <w:pPr>
+        <w:pStyle w:val="Normal"/>
         <w:rPr>
           <w:b/>
           <w:sz w:val="24"/>
           <w:lang w:val="en-US"/>
         </w:rPr>
-      </w:r>
-    </w:p>
-    <w:p>
-      <w:pPr>
-        <w:pStyle w:val="Normal"/>
+      </w:pPr>
+      <w:r>
         <w:rPr>
           <w:b/>
+          <w:sz w:val="24"/>
+          <w:lang w:val="en-US"/>
+        </w:rPr>
+      </w:r>
+    </w:p>
+    <w:p>
+      <w:pPr>
+        <w:pStyle w:val="Normal"/>
+        <w:rPr>
           <w:b/>
           <w:sz w:val="24"/>
           <w:lang w:val="en-US"/>
@@ -2607,43 +2623,6 @@
       <w:pPr>
         <w:pStyle w:val="Normal"/>
         <w:rPr>
-          <w:b/>
-          <w:b/>
-          <w:sz w:val="24"/>
-          <w:lang w:val="en-US"/>
-        </w:rPr>
-      </w:pPr>
-      <w:r>
-        <w:rPr>
-          <w:b/>
-          <w:sz w:val="24"/>
-          <w:lang w:val="en-US"/>
-        </w:rPr>
-      </w:r>
-    </w:p>
-    <w:p>
-      <w:pPr>
-        <w:pStyle w:val="Normal"/>
-        <w:rPr>
-          <w:b/>
-          <w:b/>
-          <w:sz w:val="24"/>
-          <w:lang w:val="en-US"/>
-        </w:rPr>
-      </w:pPr>
-      <w:r>
-        <w:rPr>
-          <w:b/>
-          <w:sz w:val="24"/>
-          <w:lang w:val="en-US"/>
-        </w:rPr>
-      </w:r>
-    </w:p>
-    <w:p>
-      <w:pPr>
-        <w:pStyle w:val="Normal"/>
-        <w:rPr>
-          <w:b/>
           <w:b/>
           <w:sz w:val="24"/>
           <w:lang w:val="en-US"/>
@@ -3991,6 +3970,7 @@
     <w:qFormat/>
     <w:pPr>
       <w:widowControl/>
+      <w:suppressAutoHyphens w:val="true"/>
       <w:bidi w:val="0"/>
       <w:spacing w:lineRule="auto" w:line="259" w:before="0" w:after="160"/>
       <w:jc w:val="left"/>
@@ -4015,7 +3995,7 @@
   <w:style w:type="paragraph" w:styleId="Heading">
     <w:name w:val="Heading"/>
     <w:basedOn w:val="Normal"/>
-    <w:next w:val="TextBody"/>
+    <w:next w:val="BodyText"/>
     <w:qFormat/>
     <w:pPr>
       <w:keepNext w:val="true"/>
@@ -4027,7 +4007,7 @@
       <w:szCs w:val="28"/>
     </w:rPr>
   </w:style>
-  <w:style w:type="paragraph" w:styleId="TextBody">
+  <w:style w:type="paragraph" w:styleId="BodyText">
     <w:name w:val="Body Text"/>
     <w:basedOn w:val="Normal"/>
     <w:pPr>
@@ -4037,7 +4017,7 @@
   </w:style>
   <w:style w:type="paragraph" w:styleId="List">
     <w:name w:val="List"/>
-    <w:basedOn w:val="TextBody"/>
+    <w:basedOn w:val="BodyText"/>
     <w:pPr/>
     <w:rPr>
       <w:rFonts w:cs="Lucida Sans"/>
@@ -4079,7 +4059,7 @@
     <w:rsid w:val="00d304a1"/>
     <w:pPr>
       <w:spacing w:before="0" w:after="160"/>
-      <w:ind w:left="720" w:hanging="0"/>
+      <w:ind w:hanging="0" w:left="720"/>
       <w:contextualSpacing/>
     </w:pPr>
     <w:rPr/>
@@ -4109,161 +4089,97 @@
 </file>
 
 <file path=word/theme/theme1.xml><?xml version="1.0" encoding="utf-8"?>
-<a:theme xmlns:a="http://schemas.openxmlformats.org/drawingml/2006/main" name="Kantoorthema">
+<a:theme xmlns:a="http://schemas.openxmlformats.org/drawingml/2006/main" xmlns:r="http://schemas.openxmlformats.org/officeDocument/2006/relationships" name="Kantoorthema">
   <a:themeElements>
     <a:clrScheme name="Kantoor">
       <a:dk1>
-        <a:sysClr val="windowText" lastClr="000000"/>
+        <a:srgbClr val="000000"/>
       </a:dk1>
       <a:lt1>
-        <a:sysClr val="window" lastClr="FFFFFF"/>
+        <a:srgbClr val="ffffff"/>
       </a:lt1>
       <a:dk2>
-        <a:srgbClr val="44546A"/>
+        <a:srgbClr val="44546a"/>
       </a:dk2>
       <a:lt2>
-        <a:srgbClr val="E7E6E6"/>
+        <a:srgbClr val="e7e6e6"/>
       </a:lt2>
       <a:accent1>
-        <a:srgbClr val="5B9BD5"/>
+        <a:srgbClr val="5b9bd5"/>
       </a:accent1>
       <a:accent2>
-        <a:srgbClr val="ED7D31"/>
+        <a:srgbClr val="ed7d31"/>
       </a:accent2>
       <a:accent3>
-        <a:srgbClr val="A5A5A5"/>
+        <a:srgbClr val="a5a5a5"/>
       </a:accent3>
       <a:accent4>
-        <a:srgbClr val="FFC000"/>
+        <a:srgbClr val="ffc000"/>
       </a:accent4>
       <a:accent5>
-        <a:srgbClr val="4472C4"/>
+        <a:srgbClr val="4472c4"/>
       </a:accent5>
       <a:accent6>
-        <a:srgbClr val="70AD47"/>
+        <a:srgbClr val="70ad47"/>
       </a:accent6>
       <a:hlink>
-        <a:srgbClr val="0563C1"/>
+        <a:srgbClr val="0563c1"/>
       </a:hlink>
       <a:folHlink>
-        <a:srgbClr val="954F72"/>
+        <a:srgbClr val="954f72"/>
       </a:folHlink>
     </a:clrScheme>
     <a:fontScheme name="Kantoor">
       <a:majorFont>
-        <a:latin typeface="Calibri Light" panose="020F0302020204030204"/>
+        <a:latin typeface="Calibri Light" panose="020F0302020204030204" pitchFamily="0" charset="1"/>
         <a:ea typeface=""/>
         <a:cs typeface=""/>
-        <a:font script="Jpan" typeface="游ゴシック Light"/>
-        <a:font script="Hang" typeface="맑은 고딕"/>
-        <a:font script="Hans" typeface="等线 Light"/>
-        <a:font script="Hant" typeface="新細明體"/>
-        <a:font script="Arab" typeface="Times New Roman"/>
-        <a:font script="Hebr" typeface="Times New Roman"/>
-        <a:font script="Thai" typeface="Angsana New"/>
-        <a:font script="Ethi" typeface="Nyala"/>
-        <a:font script="Beng" typeface="Vrinda"/>
-        <a:font script="Gujr" typeface="Shruti"/>
-        <a:font script="Khmr" typeface="MoolBoran"/>
-        <a:font script="Knda" typeface="Tunga"/>
-        <a:font script="Guru" typeface="Raavi"/>
-        <a:font script="Cans" typeface="Euphemia"/>
-        <a:font script="Cher" typeface="Plantagenet Cherokee"/>
-        <a:font script="Yiii" typeface="Microsoft Yi Baiti"/>
-        <a:font script="Tibt" typeface="Microsoft Himalaya"/>
-        <a:font script="Thaa" typeface="MV Boli"/>
-        <a:font script="Deva" typeface="Mangal"/>
-        <a:font script="Telu" typeface="Gautami"/>
-        <a:font script="Taml" typeface="Latha"/>
-        <a:font script="Syrc" typeface="Estrangelo Edessa"/>
-        <a:font script="Orya" typeface="Kalinga"/>
-        <a:font script="Mlym" typeface="Kartika"/>
-        <a:font script="Laoo" typeface="DokChampa"/>
-        <a:font script="Sinh" typeface="Iskoola Pota"/>
-        <a:font script="Mong" typeface="Mongolian Baiti"/>
-        <a:font script="Viet" typeface="Times New Roman"/>
-        <a:font script="Uigh" typeface="Microsoft Uighur"/>
-        <a:font script="Geor" typeface="Sylfaen"/>
       </a:majorFont>
       <a:minorFont>
-        <a:latin typeface="Calibri" panose="020F0502020204030204"/>
+        <a:latin typeface="Calibri" panose="020F0502020204030204" pitchFamily="0" charset="1"/>
         <a:ea typeface=""/>
         <a:cs typeface=""/>
-        <a:font script="Jpan" typeface="游明朝"/>
-        <a:font script="Hang" typeface="맑은 고딕"/>
-        <a:font script="Hans" typeface="等线"/>
-        <a:font script="Hant" typeface="新細明體"/>
-        <a:font script="Arab" typeface="Arial"/>
-        <a:font script="Hebr" typeface="Arial"/>
-        <a:font script="Thai" typeface="Cordia New"/>
-        <a:font script="Ethi" typeface="Nyala"/>
-        <a:font script="Beng" typeface="Vrinda"/>
-        <a:font script="Gujr" typeface="Shruti"/>
-        <a:font script="Khmr" typeface="DaunPenh"/>
-        <a:font script="Knda" typeface="Tunga"/>
-        <a:font script="Guru" typeface="Raavi"/>
-        <a:font script="Cans" typeface="Euphemia"/>
-        <a:font script="Cher" typeface="Plantagenet Cherokee"/>
-        <a:font script="Yiii" typeface="Microsoft Yi Baiti"/>
-        <a:font script="Tibt" typeface="Microsoft Himalaya"/>
-        <a:font script="Thaa" typeface="MV Boli"/>
-        <a:font script="Deva" typeface="Mangal"/>
-        <a:font script="Telu" typeface="Gautami"/>
-        <a:font script="Taml" typeface="Latha"/>
-        <a:font script="Syrc" typeface="Estrangelo Edessa"/>
-        <a:font script="Orya" typeface="Kalinga"/>
-        <a:font script="Mlym" typeface="Kartika"/>
-        <a:font script="Laoo" typeface="DokChampa"/>
-        <a:font script="Sinh" typeface="Iskoola Pota"/>
-        <a:font script="Mong" typeface="Mongolian Baiti"/>
-        <a:font script="Viet" typeface="Arial"/>
-        <a:font script="Uigh" typeface="Microsoft Uighur"/>
-        <a:font script="Geor" typeface="Sylfaen"/>
       </a:minorFont>
     </a:fontScheme>
-    <a:fmtScheme name="Kantoor">
+    <a:fmtScheme>
       <a:fillStyleLst>
         <a:solidFill>
           <a:schemeClr val="phClr"/>
         </a:solidFill>
-        <a:gradFill rotWithShape="1">
+        <a:gradFill>
           <a:gsLst>
             <a:gs pos="0">
               <a:schemeClr val="phClr">
                 <a:lumMod val="110000"/>
-                <a:satMod val="105000"/>
                 <a:tint val="67000"/>
               </a:schemeClr>
             </a:gs>
             <a:gs pos="50000">
               <a:schemeClr val="phClr">
                 <a:lumMod val="105000"/>
-                <a:satMod val="103000"/>
                 <a:tint val="73000"/>
               </a:schemeClr>
             </a:gs>
             <a:gs pos="100000">
               <a:schemeClr val="phClr">
                 <a:lumMod val="105000"/>
-                <a:satMod val="109000"/>
                 <a:tint val="81000"/>
               </a:schemeClr>
             </a:gs>
           </a:gsLst>
           <a:lin ang="5400000" scaled="0"/>
+          <a:tileRect l="0" t="0" r="0" b="0"/>
         </a:gradFill>
-        <a:gradFill rotWithShape="1">
+        <a:gradFill>
           <a:gsLst>
             <a:gs pos="0">
               <a:schemeClr val="phClr">
-                <a:satMod val="103000"/>
                 <a:lumMod val="102000"/>
                 <a:tint val="94000"/>
               </a:schemeClr>
             </a:gs>
             <a:gs pos="50000">
               <a:schemeClr val="phClr">
-                <a:satMod val="110000"/>
                 <a:lumMod val="100000"/>
                 <a:shade val="100000"/>
               </a:schemeClr>
@@ -4271,33 +4187,24 @@
             <a:gs pos="100000">
               <a:schemeClr val="phClr">
                 <a:lumMod val="99000"/>
-                <a:satMod val="120000"/>
                 <a:shade val="78000"/>
               </a:schemeClr>
             </a:gs>
           </a:gsLst>
           <a:lin ang="5400000" scaled="0"/>
+          <a:tileRect l="0" t="0" r="0" b="0"/>
         </a:gradFill>
       </a:fillStyleLst>
       <a:lnStyleLst>
         <a:ln w="6350" cap="flat" cmpd="sng" algn="ctr">
-          <a:solidFill>
-            <a:schemeClr val="phClr"/>
-          </a:solidFill>
           <a:prstDash val="solid"/>
           <a:miter lim="800000"/>
         </a:ln>
         <a:ln w="12700" cap="flat" cmpd="sng" algn="ctr">
-          <a:solidFill>
-            <a:schemeClr val="phClr"/>
-          </a:solidFill>
           <a:prstDash val="solid"/>
           <a:miter lim="800000"/>
         </a:ln>
         <a:ln w="19050" cap="flat" cmpd="sng" algn="ctr">
-          <a:solidFill>
-            <a:schemeClr val="phClr"/>
-          </a:solidFill>
           <a:prstDash val="solid"/>
           <a:miter lim="800000"/>
         </a:ln>
@@ -4310,13 +4217,7 @@
           <a:effectLst/>
         </a:effectStyle>
         <a:effectStyle>
-          <a:effectLst>
-            <a:outerShdw blurRad="57150" dist="19050" dir="5400000" algn="ctr" rotWithShape="0">
-              <a:srgbClr val="000000">
-                <a:alpha val="63000"/>
-              </a:srgbClr>
-            </a:outerShdw>
-          </a:effectLst>
+          <a:effectLst/>
         </a:effectStyle>
       </a:effectStyleLst>
       <a:bgFillStyleLst>
@@ -4326,15 +4227,13 @@
         <a:solidFill>
           <a:schemeClr val="phClr">
             <a:tint val="95000"/>
-            <a:satMod val="170000"/>
           </a:schemeClr>
         </a:solidFill>
-        <a:gradFill rotWithShape="1">
+        <a:gradFill>
           <a:gsLst>
             <a:gs pos="0">
               <a:schemeClr val="phClr">
                 <a:tint val="93000"/>
-                <a:satMod val="150000"/>
                 <a:shade val="98000"/>
                 <a:lumMod val="102000"/>
               </a:schemeClr>
@@ -4342,7 +4241,6 @@
             <a:gs pos="50000">
               <a:schemeClr val="phClr">
                 <a:tint val="98000"/>
-                <a:satMod val="130000"/>
                 <a:shade val="90000"/>
                 <a:lumMod val="103000"/>
               </a:schemeClr>
@@ -4350,21 +4248,14 @@
             <a:gs pos="100000">
               <a:schemeClr val="phClr">
                 <a:shade val="63000"/>
-                <a:satMod val="120000"/>
               </a:schemeClr>
             </a:gs>
           </a:gsLst>
           <a:lin ang="5400000" scaled="0"/>
+          <a:tileRect l="0" t="0" r="0" b="0"/>
         </a:gradFill>
       </a:bgFillStyleLst>
     </a:fmtScheme>
   </a:themeElements>
-  <a:objectDefaults/>
-  <a:extraClrSchemeLst/>
-  <a:extLst>
-    <a:ext uri="{05A4C25C-085E-4340-85A3-A5531E510DB2}">
-      <thm15:themeFamily xmlns:thm15="http://schemas.microsoft.com/office/thememl/2012/main" name="Office Theme" id="{62F939B6-93AF-4DB8-9C6B-D6C7DFDC589F}" vid="{4A3C46E8-61CC-4603-A589-7422A47A8E4A}"/>
-    </a:ext>
-  </a:extLst>
 </a:theme>
 </file>
</xml_diff>